<commit_message>
Fixed typo in the report
</commit_message>
<xml_diff>
--- a/Lab01/Lab_01_Report.docx
+++ b/Lab01/Lab_01_Report.docx
@@ -40,6 +40,21 @@
         <w:br/>
         <w:t>Student ID: 20235584</w:t>
       </w:r>
+      <w:r>
+        <w:rPr>
+          <w:sz w:val="32"/>
+          <w:szCs w:val="32"/>
+        </w:rPr>
+        <w:br/>
+        <w:t xml:space="preserve">GitHub repository: </w:t>
+      </w:r>
+      <w:r>
+        <w:rPr>
+          <w:sz w:val="32"/>
+          <w:szCs w:val="32"/>
+        </w:rPr>
+        <w:t>https://github.com/Nathan-Hoang/OOP.Lab.20261.20235584.HoangGiaNamAnh</w:t>
+      </w:r>
     </w:p>
     <w:p>
       <w:pPr>
@@ -222,6 +237,7 @@
       </w:pPr>
       <w:r>
         <w:rPr>
+          <w:noProof/>
           <w:sz w:val="32"/>
           <w:szCs w:val="32"/>
         </w:rPr>
@@ -286,6 +302,7 @@
       </w:pPr>
       <w:r>
         <w:rPr>
+          <w:noProof/>
           <w:sz w:val="32"/>
           <w:szCs w:val="32"/>
         </w:rPr>
@@ -366,6 +383,7 @@
       </w:pPr>
       <w:r>
         <w:rPr>
+          <w:noProof/>
           <w:sz w:val="32"/>
           <w:szCs w:val="32"/>
         </w:rPr>
@@ -430,6 +448,7 @@
       </w:pPr>
       <w:r>
         <w:rPr>
+          <w:noProof/>
           <w:sz w:val="32"/>
           <w:szCs w:val="32"/>
         </w:rPr>
@@ -509,6 +528,7 @@
       </w:pPr>
       <w:r>
         <w:rPr>
+          <w:noProof/>
           <w:sz w:val="32"/>
           <w:szCs w:val="32"/>
         </w:rPr>
@@ -574,6 +594,7 @@
       </w:pPr>
       <w:r>
         <w:rPr>
+          <w:noProof/>
           <w:sz w:val="32"/>
           <w:szCs w:val="32"/>
         </w:rPr>
@@ -638,6 +659,7 @@
       </w:pPr>
       <w:r>
         <w:rPr>
+          <w:noProof/>
           <w:sz w:val="32"/>
           <w:szCs w:val="32"/>
         </w:rPr>
@@ -716,6 +738,7 @@
       </w:pPr>
       <w:r>
         <w:rPr>
+          <w:noProof/>
           <w:sz w:val="32"/>
           <w:szCs w:val="32"/>
         </w:rPr>
@@ -764,6 +787,7 @@
       </w:r>
       <w:r>
         <w:rPr>
+          <w:noProof/>
           <w:sz w:val="32"/>
           <w:szCs w:val="32"/>
         </w:rPr>
@@ -812,6 +836,7 @@
       </w:r>
       <w:r>
         <w:rPr>
+          <w:noProof/>
           <w:sz w:val="32"/>
           <w:szCs w:val="32"/>
         </w:rPr>
@@ -891,6 +916,7 @@
       </w:pPr>
       <w:r>
         <w:rPr>
+          <w:noProof/>
           <w:sz w:val="32"/>
           <w:szCs w:val="32"/>
         </w:rPr>
@@ -956,6 +982,7 @@
       </w:pPr>
       <w:r>
         <w:rPr>
+          <w:noProof/>
           <w:sz w:val="32"/>
           <w:szCs w:val="32"/>
         </w:rPr>
@@ -1035,6 +1062,7 @@
       </w:pPr>
       <w:r>
         <w:rPr>
+          <w:noProof/>
           <w:sz w:val="32"/>
           <w:szCs w:val="32"/>
         </w:rPr>
@@ -1099,6 +1127,7 @@
       </w:pPr>
       <w:r>
         <w:rPr>
+          <w:noProof/>
           <w:sz w:val="32"/>
           <w:szCs w:val="32"/>
         </w:rPr>
@@ -1164,6 +1193,7 @@
       </w:pPr>
       <w:r>
         <w:rPr>
+          <w:noProof/>
           <w:sz w:val="32"/>
           <w:szCs w:val="32"/>
         </w:rPr>
@@ -1228,6 +1258,7 @@
       </w:pPr>
       <w:r>
         <w:rPr>
+          <w:noProof/>
           <w:sz w:val="32"/>
           <w:szCs w:val="32"/>
         </w:rPr>
@@ -1292,6 +1323,7 @@
       </w:pPr>
       <w:r>
         <w:rPr>
+          <w:noProof/>
           <w:sz w:val="32"/>
           <w:szCs w:val="32"/>
         </w:rPr>
@@ -1333,6 +1365,7 @@
       </w:r>
       <w:r>
         <w:rPr>
+          <w:noProof/>
           <w:sz w:val="32"/>
           <w:szCs w:val="32"/>
         </w:rPr>
@@ -1397,6 +1430,7 @@
       </w:pPr>
       <w:r>
         <w:rPr>
+          <w:noProof/>
           <w:sz w:val="32"/>
           <w:szCs w:val="32"/>
         </w:rPr>
@@ -1438,6 +1472,7 @@
       </w:r>
       <w:r>
         <w:rPr>
+          <w:noProof/>
           <w:sz w:val="32"/>
           <w:szCs w:val="32"/>
         </w:rPr>
@@ -1486,6 +1521,7 @@
       </w:r>
       <w:r>
         <w:rPr>
+          <w:noProof/>
           <w:sz w:val="32"/>
           <w:szCs w:val="32"/>
         </w:rPr>
@@ -1551,6 +1587,7 @@
       </w:pPr>
       <w:r>
         <w:rPr>
+          <w:noProof/>
           <w:sz w:val="32"/>
           <w:szCs w:val="32"/>
         </w:rPr>
@@ -1592,6 +1629,7 @@
       </w:r>
       <w:r>
         <w:rPr>
+          <w:noProof/>
           <w:sz w:val="32"/>
           <w:szCs w:val="32"/>
         </w:rPr>
@@ -1640,6 +1678,7 @@
       </w:r>
       <w:r>
         <w:rPr>
+          <w:noProof/>
           <w:sz w:val="32"/>
           <w:szCs w:val="32"/>
         </w:rPr>
@@ -1719,6 +1758,7 @@
       </w:pPr>
       <w:r>
         <w:rPr>
+          <w:noProof/>
           <w:sz w:val="32"/>
           <w:szCs w:val="32"/>
         </w:rPr>
@@ -1760,6 +1800,7 @@
       </w:r>
       <w:r>
         <w:rPr>
+          <w:noProof/>
           <w:sz w:val="32"/>
           <w:szCs w:val="32"/>
         </w:rPr>
@@ -1808,6 +1849,7 @@
       </w:r>
       <w:r>
         <w:rPr>
+          <w:noProof/>
           <w:sz w:val="32"/>
           <w:szCs w:val="32"/>
         </w:rPr>
@@ -1872,6 +1914,7 @@
       </w:pPr>
       <w:r>
         <w:rPr>
+          <w:noProof/>
           <w:sz w:val="32"/>
           <w:szCs w:val="32"/>
         </w:rPr>
@@ -1937,6 +1980,7 @@
       </w:pPr>
       <w:r>
         <w:rPr>
+          <w:noProof/>
           <w:sz w:val="32"/>
           <w:szCs w:val="32"/>
         </w:rPr>
@@ -1978,6 +2022,7 @@
       </w:r>
       <w:r>
         <w:rPr>
+          <w:noProof/>
           <w:sz w:val="32"/>
           <w:szCs w:val="32"/>
         </w:rPr>
@@ -2027,6 +2072,7 @@
       </w:pPr>
       <w:r>
         <w:rPr>
+          <w:noProof/>
           <w:sz w:val="32"/>
           <w:szCs w:val="32"/>
         </w:rPr>
@@ -2091,6 +2137,7 @@
       </w:pPr>
       <w:r>
         <w:rPr>
+          <w:noProof/>
           <w:sz w:val="32"/>
           <w:szCs w:val="32"/>
         </w:rPr>
@@ -2132,6 +2179,7 @@
       </w:r>
       <w:r>
         <w:rPr>
+          <w:noProof/>
           <w:sz w:val="32"/>
           <w:szCs w:val="32"/>
         </w:rPr>
@@ -2181,6 +2229,7 @@
       </w:pPr>
       <w:r>
         <w:rPr>
+          <w:noProof/>
           <w:sz w:val="32"/>
           <w:szCs w:val="32"/>
         </w:rPr>
@@ -2260,6 +2309,7 @@
       </w:pPr>
       <w:r>
         <w:rPr>
+          <w:noProof/>
           <w:sz w:val="32"/>
           <w:szCs w:val="32"/>
         </w:rPr>
@@ -2302,6 +2352,7 @@
       </w:r>
       <w:r>
         <w:rPr>
+          <w:noProof/>
           <w:sz w:val="32"/>
           <w:szCs w:val="32"/>
         </w:rPr>
@@ -2343,6 +2394,7 @@
       </w:r>
       <w:r>
         <w:rPr>
+          <w:noProof/>
           <w:sz w:val="32"/>
           <w:szCs w:val="32"/>
         </w:rPr>
@@ -2391,6 +2443,7 @@
       </w:r>
       <w:r>
         <w:rPr>
+          <w:noProof/>
           <w:sz w:val="32"/>
           <w:szCs w:val="32"/>
         </w:rPr>
@@ -2432,6 +2485,7 @@
       </w:r>
       <w:r>
         <w:rPr>
+          <w:noProof/>
           <w:sz w:val="32"/>
           <w:szCs w:val="32"/>
         </w:rPr>
@@ -2473,6 +2527,7 @@
       </w:r>
       <w:r>
         <w:rPr>
+          <w:noProof/>
           <w:sz w:val="32"/>
           <w:szCs w:val="32"/>
         </w:rPr>
@@ -2522,6 +2577,7 @@
       </w:pPr>
       <w:r>
         <w:rPr>
+          <w:noProof/>
           <w:sz w:val="32"/>
           <w:szCs w:val="32"/>
         </w:rPr>
@@ -2586,6 +2642,7 @@
       </w:pPr>
       <w:r>
         <w:rPr>
+          <w:noProof/>
           <w:sz w:val="32"/>
           <w:szCs w:val="32"/>
         </w:rPr>
@@ -2627,6 +2684,7 @@
       </w:r>
       <w:r>
         <w:rPr>
+          <w:noProof/>
           <w:sz w:val="32"/>
           <w:szCs w:val="32"/>
         </w:rPr>
@@ -2668,6 +2726,7 @@
       </w:r>
       <w:r>
         <w:rPr>
+          <w:noProof/>
           <w:sz w:val="32"/>
           <w:szCs w:val="32"/>
         </w:rPr>
@@ -2716,6 +2775,7 @@
       </w:r>
       <w:r>
         <w:rPr>
+          <w:noProof/>
           <w:sz w:val="32"/>
           <w:szCs w:val="32"/>
         </w:rPr>
@@ -2757,6 +2817,7 @@
       </w:r>
       <w:r>
         <w:rPr>
+          <w:noProof/>
           <w:sz w:val="32"/>
           <w:szCs w:val="32"/>
         </w:rPr>
@@ -2798,6 +2859,7 @@
       </w:r>
       <w:r>
         <w:rPr>
+          <w:noProof/>
           <w:sz w:val="32"/>
           <w:szCs w:val="32"/>
         </w:rPr>
@@ -2847,6 +2909,7 @@
       </w:pPr>
       <w:r>
         <w:rPr>
+          <w:noProof/>
           <w:sz w:val="32"/>
           <w:szCs w:val="32"/>
         </w:rPr>
@@ -2911,6 +2974,7 @@
       </w:pPr>
       <w:r>
         <w:rPr>
+          <w:noProof/>
           <w:sz w:val="32"/>
           <w:szCs w:val="32"/>
         </w:rPr>
@@ -2953,6 +3017,7 @@
       </w:r>
       <w:r>
         <w:rPr>
+          <w:noProof/>
           <w:sz w:val="32"/>
           <w:szCs w:val="32"/>
         </w:rPr>
@@ -2994,6 +3059,7 @@
       </w:r>
       <w:r>
         <w:rPr>
+          <w:noProof/>
           <w:sz w:val="32"/>
           <w:szCs w:val="32"/>
         </w:rPr>
@@ -3042,6 +3108,7 @@
       </w:r>
       <w:r>
         <w:rPr>
+          <w:noProof/>
           <w:sz w:val="32"/>
           <w:szCs w:val="32"/>
         </w:rPr>
@@ -3083,6 +3150,7 @@
       </w:r>
       <w:r>
         <w:rPr>
+          <w:noProof/>
           <w:sz w:val="32"/>
           <w:szCs w:val="32"/>
         </w:rPr>
@@ -3124,6 +3192,7 @@
       </w:r>
       <w:r>
         <w:rPr>
+          <w:noProof/>
           <w:sz w:val="32"/>
           <w:szCs w:val="32"/>
         </w:rPr>
@@ -3173,6 +3242,7 @@
       </w:pPr>
       <w:r>
         <w:rPr>
+          <w:noProof/>
           <w:sz w:val="32"/>
           <w:szCs w:val="32"/>
         </w:rPr>
@@ -3252,6 +3322,7 @@
       </w:pPr>
       <w:r>
         <w:rPr>
+          <w:noProof/>
           <w:sz w:val="32"/>
           <w:szCs w:val="32"/>
         </w:rPr>
@@ -3293,6 +3364,7 @@
       </w:r>
       <w:r>
         <w:rPr>
+          <w:noProof/>
           <w:sz w:val="32"/>
           <w:szCs w:val="32"/>
         </w:rPr>
@@ -3334,6 +3406,7 @@
       </w:r>
       <w:r>
         <w:rPr>
+          <w:noProof/>
           <w:sz w:val="32"/>
           <w:szCs w:val="32"/>
         </w:rPr>
@@ -3383,6 +3456,7 @@
       </w:pPr>
       <w:r>
         <w:rPr>
+          <w:noProof/>
           <w:sz w:val="32"/>
           <w:szCs w:val="32"/>
         </w:rPr>
@@ -3447,6 +3521,7 @@
       </w:pPr>
       <w:r>
         <w:rPr>
+          <w:noProof/>
           <w:sz w:val="32"/>
           <w:szCs w:val="32"/>
         </w:rPr>
@@ -3488,6 +3563,7 @@
       </w:r>
       <w:r>
         <w:rPr>
+          <w:noProof/>
           <w:sz w:val="32"/>
           <w:szCs w:val="32"/>
         </w:rPr>
@@ -3529,6 +3605,7 @@
       </w:r>
       <w:r>
         <w:rPr>
+          <w:noProof/>
           <w:sz w:val="32"/>
           <w:szCs w:val="32"/>
         </w:rPr>
@@ -3578,6 +3655,7 @@
       </w:pPr>
       <w:r>
         <w:rPr>
+          <w:noProof/>
           <w:sz w:val="32"/>
           <w:szCs w:val="32"/>
         </w:rPr>
@@ -3643,6 +3721,7 @@
       </w:pPr>
       <w:r>
         <w:rPr>
+          <w:noProof/>
           <w:sz w:val="32"/>
           <w:szCs w:val="32"/>
         </w:rPr>
@@ -3684,6 +3763,7 @@
       </w:r>
       <w:r>
         <w:rPr>
+          <w:noProof/>
           <w:sz w:val="32"/>
           <w:szCs w:val="32"/>
         </w:rPr>
@@ -3725,6 +3805,7 @@
       </w:r>
       <w:r>
         <w:rPr>
+          <w:noProof/>
           <w:sz w:val="32"/>
           <w:szCs w:val="32"/>
         </w:rPr>
@@ -3774,6 +3855,7 @@
       </w:pPr>
       <w:r>
         <w:rPr>
+          <w:noProof/>
           <w:sz w:val="32"/>
           <w:szCs w:val="32"/>
         </w:rPr>

</xml_diff>